<commit_message>
Kaffee-Aufgabe nach den Entscheidungen der TL umgesetzt (Ä1 bis Ä30): Modell, Blatt, Lösung, Abbildungen, Gestaltung, Sammlung
Co-Authored-By: Claude Opus 5.5 <noreply@anthropic.com>
Claude-Session: https://claude.ai/code/session_01H6HhHh1SmuARGHNzYGswr7
</commit_message>
<xml_diff>
--- a/pruefung/Kaffee_Pruefpaket_2026-10-23/umsetzung/Arbeitsordner/kaffee/Kaffee_Aufgabe.docx
+++ b/pruefung/Kaffee_Pruefpaket_2026-10-23/umsetzung/Arbeitsordner/kaffee/Kaffee_Aufgabe.docx
@@ -4,7 +4,7 @@
   <w:body>
     <w:p>
       <w:pPr>
-        <w:pStyle w:val="Zentriert"/>
+        <w:pStyle w:val="Blatttitel"/>
       </w:pPr>
       <w:r>
         <w:rPr>
@@ -17,7 +17,7 @@
     </w:p>
     <w:p>
       <w:pPr>
-        <w:pStyle w:val="BodyText"/>
+        <w:pStyle w:val="Baustein"/>
         <w:keepNext/>
       </w:pPr>
       <w:r>
@@ -39,7 +39,7 @@
     </w:p>
     <w:p>
       <w:pPr>
-        <w:pStyle w:val="BodyText"/>
+        <w:pStyle w:val="Abbildung"/>
         <w:keepNext/>
       </w:pPr>
       <w:r>
@@ -87,7 +87,7 @@
     </w:p>
     <w:p>
       <w:pPr>
-        <w:pStyle w:val="BodyText"/>
+        <w:pStyle w:val="Bildunterschrift"/>
       </w:pPr>
       <w:r>
         <w:rPr>
@@ -105,7 +105,7 @@
     </w:p>
     <w:p>
       <w:pPr>
-        <w:pStyle w:val="BodyText"/>
+        <w:pStyle w:val="Baustein"/>
         <w:keepNext/>
       </w:pPr>
       <w:r>
@@ -117,9 +117,15 @@
         <w:t xml:space="preserve">Frage 1</w:t>
       </w:r>
       <w:r>
+        <w:rPr>
+          <w:rStyle w:val="BausteinZusatz"/>
+        </w:rPr>
         <w:t xml:space="preserve"> </w:t>
       </w:r>
       <w:r>
+        <w:rPr>
+          <w:rStyle w:val="BausteinZusatz"/>
+        </w:rPr>
         <w:t xml:space="preserve">(Vorab-Frage)</w:t>
       </w:r>
     </w:p>
@@ -128,12 +134,12 @@
         <w:pStyle w:val="BodyText"/>
       </w:pPr>
       <w:r>
-        <w:t xml:space="preserve">Ihr Mitbewohner meint: „Ob man die Milch sofort oder später hineingießt, ist egal. Die Energie bleibt ja erhalten.“ Welche Tasse ist nach einer Stunde wärmer? Notieren Sie Ihre Vermutung, bevor Sie Aufgabe 1 rechnen.</w:t>
+        <w:t xml:space="preserve">Ihr Mitbewohner meint: „Ob man die Milch sofort oder später hineingießt, ist egal. Die Energie bleibt ja erhalten.“ Welche Tasse ist nach einer Stunde wärmer: Tasse 1, Tasse 2, oder sind beide gleich warm? Notieren Sie Ihre Vermutung mit einem Satz Begründung, bevor Sie Aufgabe 1 rechnen.</w:t>
       </w:r>
     </w:p>
     <w:p>
       <w:pPr>
-        <w:pStyle w:val="BodyText"/>
+        <w:pStyle w:val="Baustein"/>
         <w:keepNext/>
       </w:pPr>
       <w:r>
@@ -145,9 +151,15 @@
         <w:t xml:space="preserve">Aufgabe 1</w:t>
       </w:r>
       <w:r>
+        <w:rPr>
+          <w:rStyle w:val="BausteinZusatz"/>
+        </w:rPr>
         <w:t xml:space="preserve"> </w:t>
       </w:r>
       <w:r>
+        <w:rPr>
+          <w:rStyle w:val="BausteinZusatz"/>
+        </w:rPr>
         <w:t xml:space="preserve">(neu)</w:t>
       </w:r>
     </w:p>
@@ -156,7 +168,7 @@
         <w:pStyle w:val="BodyText"/>
       </w:pPr>
       <w:r>
-        <w:t xml:space="preserve">Um die Frage zu klären, messen Sie nach 10 Minuten die Temperatur in Tasse 2, die bis dahin noch keine Milch enthält.</w:t>
+        <w:t xml:space="preserve">Um die Frage zu klären, messen Sie nach 10 Minuten die Temperatur in Tasse 2 (noch ohne Milch).</w:t>
       </w:r>
     </w:p>
     <w:p>
@@ -181,7 +193,7 @@
         <w:pStyle w:val="Compact"/>
       </w:pPr>
       <w:r>
-        <w:t xml:space="preserve">Der Tasseninhalt wird als ideal durchmischt angenommen.</w:t>
+        <w:t xml:space="preserve">Der Tasseninhalt ist ideal durchmischt, die Milch mischt sich sofort und ohne Wärmeverlust.</w:t>
       </w:r>
     </w:p>
     <w:p>
@@ -205,24 +217,100 @@
         <w:pStyle w:val="Compact"/>
       </w:pPr>
       <w:r>
-        <w:t xml:space="preserve">Die gesamte Wärmeabgabe an die Umgebung (Konvektion, Strahlung, Verdunstung und Wärmedurchgang durch die Tassenwand) wird über ein konstantes Produkt</w:t>
+        <w:t xml:space="preserve">Die gesamte Wärmeabgabe (auch durch Strahlung und Verdunstung) ist</w:t>
       </w:r>
       <w:r>
         <w:t xml:space="preserve"> </w:t>
       </w:r>
       <m:oMath>
+        <m:sSub>
+          <m:e>
+            <m:acc>
+              <m:accPr>
+                <m:chr m:val="̇"/>
+              </m:accPr>
+              <m:e>
+                <m:r>
+                  <m:t>Q</m:t>
+                </m:r>
+              </m:e>
+            </m:acc>
+          </m:e>
+          <m:sub>
+            <m:r>
+              <m:t>a</m:t>
+            </m:r>
+            <m:r>
+              <m:t>b</m:t>
+            </m:r>
+          </m:sub>
+        </m:sSub>
+        <m:r>
+          <m:rPr>
+            <m:sty m:val="p"/>
+          </m:rPr>
+          <m:t>=</m:t>
+        </m:r>
         <m:r>
           <m:t>k</m:t>
         </m:r>
         <m:r>
           <m:t>A</m:t>
         </m:r>
+        <m:r>
+          <m:t> </m:t>
+        </m:r>
+        <m:d>
+          <m:dPr>
+            <m:begChr m:val="("/>
+            <m:endChr m:val=")"/>
+            <m:sepChr m:val=""/>
+            <m:grow/>
+          </m:dPr>
+          <m:e>
+            <m:r>
+              <m:t>ϑ</m:t>
+            </m:r>
+            <m:r>
+              <m:rPr>
+                <m:sty m:val="p"/>
+              </m:rPr>
+              <m:t>−</m:t>
+            </m:r>
+            <m:sSub>
+              <m:e>
+                <m:r>
+                  <m:t>ϑ</m:t>
+                </m:r>
+              </m:e>
+              <m:sub>
+                <m:r>
+                  <m:t>u</m:t>
+                </m:r>
+              </m:sub>
+            </m:sSub>
+          </m:e>
+        </m:d>
       </m:oMath>
       <w:r>
         <w:t xml:space="preserve"> </w:t>
       </w:r>
       <w:r>
-        <w:t xml:space="preserve">beschrieben, das mit und ohne Milch gleich ist. Die verdunstete Masse wird vernachlässigt.</w:t>
+        <w:t xml:space="preserve">mit konstantem</w:t>
+      </w:r>
+      <w:r>
+        <w:t xml:space="preserve"> </w:t>
+      </w:r>
+      <m:oMath>
+        <m:r>
+          <m:t>k</m:t>
+        </m:r>
+        <m:r>
+          <m:t>A</m:t>
+        </m:r>
+      </m:oMath>
+      <w:r>
+        <w:t xml:space="preserve">; die verdunstete Masse wird vernachlässigt.</w:t>
       </w:r>
     </w:p>
     <w:p>
@@ -234,30 +322,51 @@
         <w:pStyle w:val="Compact"/>
       </w:pPr>
       <w:r>
-        <w:t xml:space="preserve">Kaffee und Milch mischen sich sofort und ohne Wärmeverlust.</w:t>
+        <w:t xml:space="preserve">Kaffee (Stoffdaten von Wasser) und Milch sind inkompressibel (</w:t>
+      </w:r>
+      <m:oMath>
+        <m:sSub>
+          <m:e>
+            <m:r>
+              <m:t>c</m:t>
+            </m:r>
+          </m:e>
+          <m:sub>
+            <m:r>
+              <m:t>p</m:t>
+            </m:r>
+          </m:sub>
+        </m:sSub>
+        <m:r>
+          <m:rPr>
+            <m:sty m:val="p"/>
+          </m:rPr>
+          <m:t>=</m:t>
+        </m:r>
+        <m:sSub>
+          <m:e>
+            <m:r>
+              <m:t>c</m:t>
+            </m:r>
+          </m:e>
+          <m:sub>
+            <m:r>
+              <m:t>v</m:t>
+            </m:r>
+          </m:sub>
+        </m:sSub>
+      </m:oMath>
+      <w:r>
+        <w:t xml:space="preserve">); die Stoffdaten sind konstant.</w:t>
       </w:r>
     </w:p>
     <w:p>
       <w:pPr>
-        <w:numPr>
-          <w:ilvl w:val="0"/>
-          <w:numId w:val="1001"/>
-        </w:numPr>
-        <w:pStyle w:val="Compact"/>
-      </w:pPr>
-      <w:r>
-        <w:t xml:space="preserve">Die Stoffdaten sind unabhängig von der Temperatur; Kaffee hat die Stoffdaten von Wasser.</w:t>
-      </w:r>
-    </w:p>
-    <w:p>
-      <w:pPr>
         <w:pStyle w:val="FirstParagraph"/>
         <w:keepNext/>
       </w:pPr>
       <w:r>
         <w:rPr>
-          <w:iCs/>
-          <w:i/>
           <w:bCs/>
           <w:b/>
         </w:rPr>
@@ -272,10 +381,10 @@
         <w:jc w:val="start"/>
       </w:tblPr>
       <w:tblGrid>
-        <w:gridCol w:w="1675"/>
-        <w:gridCol w:w="2284"/>
-        <w:gridCol w:w="1675"/>
-        <w:gridCol w:w="2284"/>
+        <w:gridCol w:w="1835"/>
+        <w:gridCol w:w="2124"/>
+        <w:gridCol w:w="1835"/>
+        <w:gridCol w:w="2124"/>
       </w:tblGrid>
       <w:tr>
         <w:trPr>
@@ -292,12 +401,10 @@
             </w:pPr>
             <w:r>
               <w:rPr>
-                <w:iCs/>
-                <w:i/>
                 <w:bCs/>
                 <w:b/>
               </w:rPr>
-              <w:t xml:space="preserve">Kaffee:</w:t>
+              <w:t xml:space="preserve">Kaffee</w:t>
             </w:r>
           </w:p>
         </w:tc>
@@ -320,12 +427,10 @@
             </w:pPr>
             <w:r>
               <w:rPr>
-                <w:iCs/>
-                <w:i/>
                 <w:bCs/>
                 <w:b/>
               </w:rPr>
-              <w:t xml:space="preserve">Milch:</w:t>
+              <w:t xml:space="preserve">Milch</w:t>
             </w:r>
           </w:p>
         </w:tc>
@@ -352,7 +457,7 @@
               <w:jc w:val="left"/>
             </w:pPr>
             <w:r>
-              <w:t xml:space="preserve">Volumen:</w:t>
+              <w:t xml:space="preserve">Volumen</w:t>
             </w:r>
           </w:p>
         </w:tc>
@@ -413,7 +518,7 @@
               <w:jc w:val="left"/>
             </w:pPr>
             <w:r>
-              <w:t xml:space="preserve">Volumen:</w:t>
+              <w:t xml:space="preserve">Volumen</w:t>
             </w:r>
           </w:p>
         </w:tc>
@@ -479,7 +584,7 @@
               <w:jc w:val="left"/>
             </w:pPr>
             <w:r>
-              <w:t xml:space="preserve">Dichte:</w:t>
+              <w:t xml:space="preserve">Dichte</w:t>
             </w:r>
           </w:p>
         </w:tc>
@@ -564,7 +669,7 @@
               <w:jc w:val="left"/>
             </w:pPr>
             <w:r>
-              <w:t xml:space="preserve">Dichte:</w:t>
+              <w:t xml:space="preserve">Dichte</w:t>
             </w:r>
           </w:p>
         </w:tc>
@@ -654,7 +759,7 @@
               <w:jc w:val="left"/>
             </w:pPr>
             <w:r>
-              <w:t xml:space="preserve">Spez. Wärmekapazität:</w:t>
+              <w:t xml:space="preserve">Spez. Wärmekapazität</w:t>
             </w:r>
           </w:p>
         </w:tc>
@@ -773,7 +878,7 @@
               <w:jc w:val="left"/>
             </w:pPr>
             <w:r>
-              <w:t xml:space="preserve">Spez. Wärmekapazität:</w:t>
+              <w:t xml:space="preserve">Spez. Wärmekapazität</w:t>
             </w:r>
           </w:p>
         </w:tc>
@@ -897,15 +1002,40 @@
               <w:jc w:val="left"/>
             </w:pPr>
             <w:r>
-              <w:t xml:space="preserve">Temperatur bei</w:t>
+              <w:t xml:space="preserve">Anfangstemperatur</w:t>
             </w:r>
-            <w:r>
-              <w:t xml:space="preserve"> </w:t>
-            </w:r>
+          </w:p>
+        </w:tc>
+        <w:tc>
+          <w:tcPr/>
+          <w:p>
+            <w:pPr>
+              <w:pStyle w:val="Compact"/>
+              <w:keepNext/>
+              <w:jc w:val="left"/>
+            </w:pPr>
             <m:oMath>
-              <m:r>
-                <m:t>t</m:t>
-              </m:r>
+              <m:sSub>
+                <m:e>
+                  <m:r>
+                    <m:t>ϑ</m:t>
+                  </m:r>
+                </m:e>
+                <m:sub>
+                  <m:r>
+                    <m:t>K</m:t>
+                  </m:r>
+                  <m:r>
+                    <m:rPr>
+                      <m:sty m:val="p"/>
+                    </m:rPr>
+                    <m:t>,</m:t>
+                  </m:r>
+                  <m:r>
+                    <m:t>0</m:t>
+                  </m:r>
+                </m:sub>
+              </m:sSub>
               <m:r>
                 <m:rPr>
                   <m:sty m:val="p"/>
@@ -913,51 +1043,6 @@
                 <m:t>=</m:t>
               </m:r>
               <m:r>
-                <m:t>0</m:t>
-              </m:r>
-            </m:oMath>
-            <w:r>
-              <w:t xml:space="preserve">:</w:t>
-            </w:r>
-          </w:p>
-        </w:tc>
-        <w:tc>
-          <w:tcPr/>
-          <w:p>
-            <w:pPr>
-              <w:pStyle w:val="Compact"/>
-              <w:keepNext/>
-              <w:jc w:val="left"/>
-            </w:pPr>
-            <m:oMath>
-              <m:sSub>
-                <m:e>
-                  <m:r>
-                    <m:t>ϑ</m:t>
-                  </m:r>
-                </m:e>
-                <m:sub>
-                  <m:r>
-                    <m:t>K</m:t>
-                  </m:r>
-                  <m:r>
-                    <m:rPr>
-                      <m:sty m:val="p"/>
-                    </m:rPr>
-                    <m:t>,</m:t>
-                  </m:r>
-                  <m:r>
-                    <m:t>0</m:t>
-                  </m:r>
-                </m:sub>
-              </m:sSub>
-              <m:r>
-                <m:rPr>
-                  <m:sty m:val="p"/>
-                </m:rPr>
-                <m:t>=</m:t>
-              </m:r>
-              <m:r>
                 <m:t>80</m:t>
               </m:r>
               <m:r>
@@ -987,7 +1072,7 @@
               <w:jc w:val="left"/>
             </w:pPr>
             <w:r>
-              <w:t xml:space="preserve">Temperatur:</w:t>
+              <w:t xml:space="preserve">Temperatur</w:t>
             </w:r>
           </w:p>
         </w:tc>
@@ -1050,25 +1135,41 @@
             <w:pPr>
               <w:pStyle w:val="Compact"/>
               <w:keepNext/>
-            </w:pPr>
-          </w:p>
-        </w:tc>
-        <w:tc>
-          <w:tcPr/>
-          <w:p>
-            <w:pPr>
-              <w:pStyle w:val="Compact"/>
-              <w:keepNext/>
-            </w:pPr>
-          </w:p>
-        </w:tc>
-        <w:tc>
-          <w:tcPr/>
-          <w:p>
-            <w:pPr>
-              <w:pStyle w:val="Compact"/>
-              <w:keepNext/>
-            </w:pPr>
+              <w:jc w:val="left"/>
+            </w:pPr>
+            <w:r>
+              <w:rPr>
+                <w:bCs/>
+                <w:b/>
+              </w:rPr>
+              <w:t xml:space="preserve">Umgebung</w:t>
+            </w:r>
+          </w:p>
+        </w:tc>
+        <w:tc>
+          <w:tcPr/>
+          <w:p>
+            <w:pPr>
+              <w:pStyle w:val="Compact"/>
+              <w:keepNext/>
+            </w:pPr>
+          </w:p>
+        </w:tc>
+        <w:tc>
+          <w:tcPr/>
+          <w:p>
+            <w:pPr>
+              <w:pStyle w:val="Compact"/>
+              <w:keepNext/>
+              <w:jc w:val="left"/>
+            </w:pPr>
+            <w:r>
+              <w:rPr>
+                <w:bCs/>
+                <w:b/>
+              </w:rPr>
+              <w:t xml:space="preserve">Messung in Tasse 2</w:t>
+            </w:r>
           </w:p>
         </w:tc>
         <w:tc>
@@ -1094,68 +1195,7 @@
               <w:jc w:val="left"/>
             </w:pPr>
             <w:r>
-              <w:rPr>
-                <w:iCs/>
-                <w:i/>
-                <w:bCs/>
-                <w:b/>
-              </w:rPr>
-              <w:t xml:space="preserve">Umgebung:</w:t>
-            </w:r>
-          </w:p>
-        </w:tc>
-        <w:tc>
-          <w:tcPr/>
-          <w:p>
-            <w:pPr>
-              <w:pStyle w:val="Compact"/>
-              <w:keepNext/>
-            </w:pPr>
-          </w:p>
-        </w:tc>
-        <w:tc>
-          <w:tcPr/>
-          <w:p>
-            <w:pPr>
-              <w:pStyle w:val="Compact"/>
-              <w:keepNext/>
-              <w:jc w:val="left"/>
-            </w:pPr>
-            <w:r>
-              <w:rPr>
-                <w:iCs/>
-                <w:i/>
-                <w:bCs/>
-                <w:b/>
-              </w:rPr>
-              <w:t xml:space="preserve">Messung:</w:t>
-            </w:r>
-          </w:p>
-        </w:tc>
-        <w:tc>
-          <w:tcPr/>
-          <w:p>
-            <w:pPr>
-              <w:pStyle w:val="Compact"/>
-              <w:keepNext/>
-            </w:pPr>
-          </w:p>
-        </w:tc>
-      </w:tr>
-      <w:tr>
-        <w:trPr>
-          <w:cantSplit/>
-        </w:trPr>
-        <w:tc>
-          <w:tcPr/>
-          <w:p>
-            <w:pPr>
-              <w:pStyle w:val="Compact"/>
-              <w:keepNext/>
-              <w:jc w:val="left"/>
-            </w:pPr>
-            <w:r>
-              <w:t xml:space="preserve">Temperatur:</w:t>
+              <w:t xml:space="preserve">Temperatur</w:t>
             </w:r>
           </w:p>
         </w:tc>
@@ -1216,7 +1256,7 @@
               <w:jc w:val="left"/>
             </w:pPr>
             <w:r>
-              <w:t xml:space="preserve">Temperatur nach 10 min:</w:t>
+              <w:t xml:space="preserve">nach 10 min</w:t>
             </w:r>
           </w:p>
         </w:tc>
@@ -1313,25 +1353,41 @@
             <w:pPr>
               <w:pStyle w:val="Compact"/>
               <w:keepNext/>
-            </w:pPr>
-          </w:p>
-        </w:tc>
-        <w:tc>
-          <w:tcPr/>
-          <w:p>
-            <w:pPr>
-              <w:pStyle w:val="Compact"/>
-              <w:keepNext/>
-            </w:pPr>
-          </w:p>
-        </w:tc>
-        <w:tc>
-          <w:tcPr/>
-          <w:p>
-            <w:pPr>
-              <w:pStyle w:val="Compact"/>
-              <w:keepNext/>
-            </w:pPr>
+              <w:jc w:val="left"/>
+            </w:pPr>
+            <w:r>
+              <w:rPr>
+                <w:bCs/>
+                <w:b/>
+              </w:rPr>
+              <w:t xml:space="preserve">Becher ab Teil f</w:t>
+            </w:r>
+          </w:p>
+        </w:tc>
+        <w:tc>
+          <w:tcPr/>
+          <w:p>
+            <w:pPr>
+              <w:pStyle w:val="Compact"/>
+              <w:keepNext/>
+            </w:pPr>
+          </w:p>
+        </w:tc>
+        <w:tc>
+          <w:tcPr/>
+          <w:p>
+            <w:pPr>
+              <w:pStyle w:val="Compact"/>
+              <w:keepNext/>
+              <w:jc w:val="left"/>
+            </w:pPr>
+            <w:r>
+              <w:rPr>
+                <w:bCs/>
+                <w:b/>
+              </w:rPr>
+              <w:t xml:space="preserve">Milch in Teil g</w:t>
+            </w:r>
           </w:p>
         </w:tc>
         <w:tc>
@@ -1357,13 +1413,7 @@
               <w:jc w:val="left"/>
             </w:pPr>
             <w:r>
-              <w:rPr>
-                <w:iCs/>
-                <w:i/>
-                <w:bCs/>
-                <w:b/>
-              </w:rPr>
-              <w:t xml:space="preserve">Becher:</w:t>
+              <w:t xml:space="preserve">Masse</w:t>
             </w:r>
           </w:p>
         </w:tc>
@@ -1373,25 +1423,52 @@
             <w:pPr>
               <w:pStyle w:val="Compact"/>
               <w:keepNext/>
-            </w:pPr>
-          </w:p>
-        </w:tc>
-        <w:tc>
-          <w:tcPr/>
-          <w:p>
-            <w:pPr>
-              <w:pStyle w:val="Compact"/>
-              <w:keepNext/>
               <w:jc w:val="left"/>
             </w:pPr>
+            <m:oMath>
+              <m:sSub>
+                <m:e>
+                  <m:r>
+                    <m:t>m</m:t>
+                  </m:r>
+                </m:e>
+                <m:sub>
+                  <m:r>
+                    <m:t>B</m:t>
+                  </m:r>
+                </m:sub>
+              </m:sSub>
+              <m:r>
+                <m:rPr>
+                  <m:sty m:val="p"/>
+                </m:rPr>
+                <m:t>=</m:t>
+              </m:r>
+              <m:r>
+                <m:t>300</m:t>
+              </m:r>
+              <m:r>
+                <m:t> </m:t>
+              </m:r>
+              <m:r>
+                <m:rPr>
+                  <m:sty m:val="p"/>
+                </m:rPr>
+                <m:t>g</m:t>
+              </m:r>
+            </m:oMath>
+          </w:p>
+        </w:tc>
+        <w:tc>
+          <w:tcPr/>
+          <w:p>
+            <w:pPr>
+              <w:pStyle w:val="Compact"/>
+              <w:keepNext/>
+              <w:jc w:val="left"/>
+            </w:pPr>
             <w:r>
-              <w:rPr>
-                <w:iCs/>
-                <w:i/>
-                <w:bCs/>
-                <w:b/>
-              </w:rPr>
-              <w:t xml:space="preserve">Milchschaum:</w:t>
+              <w:t xml:space="preserve">Temperatur</w:t>
             </w:r>
           </w:p>
         </w:tc>
@@ -1401,7 +1478,55 @@
             <w:pPr>
               <w:pStyle w:val="Compact"/>
               <w:keepNext/>
-            </w:pPr>
+              <w:jc w:val="left"/>
+            </w:pPr>
+            <m:oMath>
+              <m:sSub>
+                <m:e>
+                  <m:r>
+                    <m:t>ϑ</m:t>
+                  </m:r>
+                </m:e>
+                <m:sub>
+                  <m:r>
+                    <m:t>M</m:t>
+                  </m:r>
+                  <m:r>
+                    <m:rPr>
+                      <m:sty m:val="p"/>
+                    </m:rPr>
+                    <m:t>,</m:t>
+                  </m:r>
+                  <m:r>
+                    <m:t>h</m:t>
+                  </m:r>
+                </m:sub>
+              </m:sSub>
+              <m:r>
+                <m:rPr>
+                  <m:sty m:val="p"/>
+                </m:rPr>
+                <m:t>=</m:t>
+              </m:r>
+              <m:r>
+                <m:t>60</m:t>
+              </m:r>
+              <m:r>
+                <m:t> </m:t>
+              </m:r>
+              <m:r>
+                <m:rPr>
+                  <m:sty m:val="p"/>
+                </m:rPr>
+                <m:t>°</m:t>
+              </m:r>
+              <m:r>
+                <m:rPr>
+                  <m:sty m:val="p"/>
+                </m:rPr>
+                <m:t>C</m:t>
+              </m:r>
+            </m:oMath>
           </w:p>
         </w:tc>
       </w:tr>
@@ -1414,131 +1539,10 @@
           <w:p>
             <w:pPr>
               <w:pStyle w:val="Compact"/>
-              <w:keepNext/>
               <w:jc w:val="left"/>
             </w:pPr>
             <w:r>
-              <w:t xml:space="preserve">Masse:</w:t>
-            </w:r>
-          </w:p>
-        </w:tc>
-        <w:tc>
-          <w:tcPr/>
-          <w:p>
-            <w:pPr>
-              <w:pStyle w:val="Compact"/>
-              <w:keepNext/>
-              <w:jc w:val="left"/>
-            </w:pPr>
-            <m:oMath>
-              <m:sSub>
-                <m:e>
-                  <m:r>
-                    <m:t>m</m:t>
-                  </m:r>
-                </m:e>
-                <m:sub>
-                  <m:r>
-                    <m:t>B</m:t>
-                  </m:r>
-                </m:sub>
-              </m:sSub>
-              <m:r>
-                <m:rPr>
-                  <m:sty m:val="p"/>
-                </m:rPr>
-                <m:t>=</m:t>
-              </m:r>
-              <m:r>
-                <m:t>300</m:t>
-              </m:r>
-              <m:r>
-                <m:t> </m:t>
-              </m:r>
-              <m:r>
-                <m:rPr>
-                  <m:sty m:val="p"/>
-                </m:rPr>
-                <m:t>g</m:t>
-              </m:r>
-            </m:oMath>
-          </w:p>
-        </w:tc>
-        <w:tc>
-          <w:tcPr/>
-          <w:p>
-            <w:pPr>
-              <w:pStyle w:val="Compact"/>
-              <w:keepNext/>
-              <w:jc w:val="left"/>
-            </w:pPr>
-            <w:r>
-              <w:t xml:space="preserve">Temperatur:</w:t>
-            </w:r>
-          </w:p>
-        </w:tc>
-        <w:tc>
-          <w:tcPr/>
-          <w:p>
-            <w:pPr>
-              <w:pStyle w:val="Compact"/>
-              <w:keepNext/>
-              <w:jc w:val="left"/>
-            </w:pPr>
-            <m:oMath>
-              <m:sSub>
-                <m:e>
-                  <m:r>
-                    <m:t>ϑ</m:t>
-                  </m:r>
-                </m:e>
-                <m:sub>
-                  <m:r>
-                    <m:t>S</m:t>
-                  </m:r>
-                </m:sub>
-              </m:sSub>
-              <m:r>
-                <m:rPr>
-                  <m:sty m:val="p"/>
-                </m:rPr>
-                <m:t>=</m:t>
-              </m:r>
-              <m:r>
-                <m:t>60</m:t>
-              </m:r>
-              <m:r>
-                <m:t> </m:t>
-              </m:r>
-              <m:r>
-                <m:rPr>
-                  <m:sty m:val="p"/>
-                </m:rPr>
-                <m:t>°</m:t>
-              </m:r>
-              <m:r>
-                <m:rPr>
-                  <m:sty m:val="p"/>
-                </m:rPr>
-                <m:t>C</m:t>
-              </m:r>
-            </m:oMath>
-          </w:p>
-        </w:tc>
-      </w:tr>
-      <w:tr>
-        <w:trPr>
-          <w:cantSplit/>
-        </w:trPr>
-        <w:tc>
-          <w:tcPr/>
-          <w:p>
-            <w:pPr>
-              <w:pStyle w:val="Compact"/>
-              <w:jc w:val="left"/>
-            </w:pPr>
-            <w:r>
-              <w:t xml:space="preserve">Spez. Wärmekapazität:</w:t>
+              <w:t xml:space="preserve">Spez. Wärmekapazität</w:t>
             </w:r>
           </w:p>
         </w:tc>
@@ -1779,7 +1783,7 @@
         </w:numPr>
       </w:pPr>
       <w:r>
-        <w:t xml:space="preserve">Zeichnen Sie den Bilanzraum für Tasse 1 in Abb. 1 ein und stellen Sie die instationäre Energiebilanz für den Inhalt einer Tasse auf. Lösen Sie die Differentialgleichung durch Trennung der Variablen für die Anfangstemperatur</w:t>
+        <w:t xml:space="preserve">Zeichnen Sie den Bilanzraum um den Inhalt von Tasse 1 in Abb. 1 ein. Vereinfachen Sie die allgemeine Energiebilanz zur globalen instationären Bilanz für den Inhalt einer Tasse und begründen Sie, welche Terme entfallen. Lösen Sie sie durch Trennung der Variablen für</w:t>
       </w:r>
       <w:r>
         <w:t xml:space="preserve"> </w:t>
@@ -2002,7 +2006,7 @@
         </w:numPr>
       </w:pPr>
       <w:r>
-        <w:t xml:space="preserve">Bestimmen Sie aus der Messung in Tasse 2 das Produkt</w:t>
+        <w:t xml:space="preserve">Bestimmen Sie</w:t>
       </w:r>
       <w:r>
         <w:t xml:space="preserve"> </w:t>
@@ -2016,7 +2020,10 @@
         </m:r>
       </m:oMath>
       <w:r>
-        <w:t xml:space="preserve">.</w:t>
+        <w:t xml:space="preserve"> </w:t>
+      </w:r>
+      <w:r>
+        <w:t xml:space="preserve">aus der Messung in Tasse 2. Welche Annahme brauchen Sie, um diesen Wert auch für Tasse 1 zu verwenden, und ist sie plausibel?</w:t>
       </w:r>
       <w:r>
         <w:br/>
@@ -2077,7 +2084,7 @@
         </w:numPr>
       </w:pPr>
       <w:r>
-        <w:t xml:space="preserve">Berechnen Sie die Temperaturen</w:t>
+        <w:t xml:space="preserve">Berechnen Sie</w:t>
       </w:r>
       <w:r>
         <w:t xml:space="preserve"> </w:t>
@@ -2123,7 +2130,36 @@
         <w:t xml:space="preserve"> </w:t>
       </w:r>
       <w:r>
-        <w:t xml:space="preserve">beider Tassen nach 60 Minuten, bei Tasse 2 direkt nach dem Zugießen der Milch. Welche Tasse ist kühler?</w:t>
+        <w:t xml:space="preserve">nach 60 Minuten (Tasse 2 direkt nach dem Zugießen). Welches</w:t>
+      </w:r>
+      <w:r>
+        <w:t xml:space="preserve"> </w:t>
+      </w:r>
+      <m:oMath>
+        <m:r>
+          <m:t>m</m:t>
+        </m:r>
+        <m:r>
+          <m:t> </m:t>
+        </m:r>
+        <m:sSub>
+          <m:e>
+            <m:r>
+              <m:t>c</m:t>
+            </m:r>
+          </m:e>
+          <m:sub>
+            <m:r>
+              <m:t>p</m:t>
+            </m:r>
+          </m:sub>
+        </m:sSub>
+      </m:oMath>
+      <w:r>
+        <w:t xml:space="preserve"> </w:t>
+      </w:r>
+      <w:r>
+        <w:t xml:space="preserve">setzen Sie jeweils ein? Welche Tasse ist wärmer?</w:t>
       </w:r>
       <w:r>
         <w:br/>
@@ -2240,7 +2276,48 @@
         </w:numPr>
       </w:pPr>
       <w:r>
-        <w:t xml:space="preserve">Berechnen Sie für beide Tassen die Wärme, die in den 60 Minuten an die Umgebung abgegeben wird. Erklären Sie damit das Ergebnis aus d). Hat Ihr Mitbewohner recht?</w:t>
+        <w:t xml:space="preserve">Berechnen Sie die Wärme, die jede Tasse in 60 Minuten an die Umgebung abgibt. Zeigen Sie, dass</w:t>
+      </w:r>
+      <w:r>
+        <w:t xml:space="preserve"> </w:t>
+      </w:r>
+      <m:oMath>
+        <m:sSub>
+          <m:e>
+            <m:r>
+              <m:t>Q</m:t>
+            </m:r>
+          </m:e>
+          <m:sub>
+            <m:r>
+              <m:t>2</m:t>
+            </m:r>
+          </m:sub>
+        </m:sSub>
+        <m:r>
+          <m:rPr>
+            <m:sty m:val="p"/>
+          </m:rPr>
+          <m:t>−</m:t>
+        </m:r>
+        <m:sSub>
+          <m:e>
+            <m:r>
+              <m:t>Q</m:t>
+            </m:r>
+          </m:e>
+          <m:sub>
+            <m:r>
+              <m:t>1</m:t>
+            </m:r>
+          </m:sub>
+        </m:sSub>
+      </m:oMath>
+      <w:r>
+        <w:t xml:space="preserve"> </w:t>
+      </w:r>
+      <w:r>
+        <w:t xml:space="preserve">den Temperaturunterschied aus d) erklärt. Wo liegt der Denkfehler Ihres Mitbewohners?</w:t>
       </w:r>
       <w:r>
         <w:br/>
@@ -2357,11 +2434,21 @@
         </w:numPr>
       </w:pPr>
       <w:r>
-        <w:t xml:space="preserve">Die Tassen sind in Wirklichkeit Keramikbecher. Sie wurden vorgewärmt und haben immer die Temperatur ihres Inhalts. Bestimmen Sie</w:t>
+        <w:rPr>
+          <w:iCs/>
+          <w:i/>
+        </w:rPr>
+        <w:t xml:space="preserve">Vertiefung:</w:t>
       </w:r>
       <w:r>
         <w:t xml:space="preserve"> </w:t>
       </w:r>
+      <w:r>
+        <w:t xml:space="preserve">Die Tassen sind vorgewärmte Keramikbecher, die immer die Temperatur ihres Inhalts haben, auch beim Zugießen der Milch. Passen Sie Bilanzraum und Bilanz aus b) an, bestimmen Sie</w:t>
+      </w:r>
+      <w:r>
+        <w:t xml:space="preserve"> </w:t>
+      </w:r>
       <m:oMath>
         <m:r>
           <m:t>k</m:t>
@@ -2374,7 +2461,7 @@
         <w:t xml:space="preserve"> </w:t>
       </w:r>
       <w:r>
-        <w:t xml:space="preserve">mit Becher erneut aus der Messung und berechnen Sie</w:t>
+        <w:t xml:space="preserve">neu und berechnen Sie</w:t>
       </w:r>
       <w:r>
         <w:t xml:space="preserve"> </w:t>
@@ -2417,10 +2504,7 @@
         </m:sSub>
       </m:oMath>
       <w:r>
-        <w:t xml:space="preserve"> </w:t>
-      </w:r>
-      <w:r>
-        <w:t xml:space="preserve">noch einmal. Bleibt die Aussage aus d) gültig?</w:t>
+        <w:t xml:space="preserve">. Gilt die Aussage aus d) weiter?</w:t>
       </w:r>
       <w:r>
         <w:br/>
@@ -2593,7 +2677,7 @@
         </w:numPr>
       </w:pPr>
       <w:r>
-        <w:t xml:space="preserve">Am nächsten Tag trinkt Ihr Mitbewohner Cappuccino: Statt kalter Milch kommt Milchschaum mit</w:t>
+        <w:t xml:space="preserve">Am nächsten Tag gibt es Milchkaffee: Die Milch wird je Tasse kurz vorher auf</w:t>
       </w:r>
       <w:r>
         <w:t xml:space="preserve"> </w:t>
@@ -2607,7 +2691,16 @@
           </m:e>
           <m:sub>
             <m:r>
-              <m:t>S</m:t>
+              <m:t>M</m:t>
+            </m:r>
+            <m:r>
+              <m:rPr>
+                <m:sty m:val="p"/>
+              </m:rPr>
+              <m:t>,</m:t>
+            </m:r>
+            <m:r>
+              <m:t>h</m:t>
             </m:r>
           </m:sub>
         </m:sSub>
@@ -2616,30 +2709,12 @@
         <w:t xml:space="preserve"> </w:t>
       </w:r>
       <w:r>
-        <w:t xml:space="preserve">in beide Tassen (gleiche Masse, Becher wieder vernachlässigt). Sagen Sie zuerst voraus, welche Tasse nach 60 Minuten wärmer ist. Prüfen Sie Ihre Vorhersage dann mit den Gleichungen aus d).</w:t>
+        <w:t xml:space="preserve">erwärmt und untergerührt (gleiche Masse und Stoffdaten, ohne Becher). Welche Tasse ist nach 60 Minuten wärmer? Sagen Sie es mit kurzer Begründung voraus, prüfen Sie dann mit den Gleichungen aus d) und erklären Sie das Ergebnis.</w:t>
       </w:r>
       <w:r>
         <w:br/>
       </w:r>
       <m:oMath>
-        <m:sSub>
-          <m:e>
-            <m:r>
-              <m:t>ϑ</m:t>
-            </m:r>
-          </m:e>
-          <m:sub>
-            <m:r>
-              <m:t>1</m:t>
-            </m:r>
-          </m:sub>
-        </m:sSub>
-        <m:r>
-          <m:rPr>
-            <m:sty m:val="p"/>
-          </m:rPr>
-          <m:t>=</m:t>
-        </m:r>
         <m:r>
           <m:t>35</m:t>
         </m:r>
@@ -2669,34 +2744,16 @@
         </m:r>
       </m:oMath>
       <w:r>
-        <w:t xml:space="preserve">,</w:t>
-      </w:r>
-      <w:r>
         <w:t xml:space="preserve"> </w:t>
       </w:r>
+      <w:r>
+        <w:t xml:space="preserve">und</w:t>
+      </w:r>
+      <w:r>
+        <w:t xml:space="preserve"> </w:t>
+      </w:r>
       <m:oMath>
         <m:r>
-          <m:t> </m:t>
-        </m:r>
-        <m:sSub>
-          <m:e>
-            <m:r>
-              <m:t>ϑ</m:t>
-            </m:r>
-          </m:e>
-          <m:sub>
-            <m:r>
-              <m:t>2</m:t>
-            </m:r>
-          </m:sub>
-        </m:sSub>
-        <m:r>
-          <m:rPr>
-            <m:sty m:val="p"/>
-          </m:rPr>
-          <m:t>=</m:t>
-        </m:r>
-        <m:r>
           <m:t>37</m:t>
         </m:r>
         <m:r>
@@ -2724,6 +2781,12 @@
           <m:t>C</m:t>
         </m:r>
       </m:oMath>
+      <w:r>
+        <w:t xml:space="preserve"> </w:t>
+      </w:r>
+      <w:r>
+        <w:t xml:space="preserve">(Zuordnung selbst bestimmen)</w:t>
+      </w:r>
     </w:p>
     <w:p>
       <w:pPr>
@@ -2743,7 +2806,7 @@
         <w:t xml:space="preserve"> </w:t>
       </w:r>
       <w:r>
-        <w:t xml:space="preserve">(1) Bei welcher Milchtemperatur ist es egal, ob die Milch sofort oder erst nach 60 Minuten hineinkommt (ohne Becher)? (2) Sie nehmen die Milch für Tasse 2 schon bei</w:t>
+        <w:t xml:space="preserve">(1) Bei welcher Milchtemperatur sind beide Tassen nach 60 Minuten gleich warm (ohne Becher)? (2) Die Milch für Tasse 2 steht ab</w:t>
       </w:r>
       <w:r>
         <w:t xml:space="preserve"> </w:t>
@@ -2766,16 +2829,10 @@
         <w:t xml:space="preserve"> </w:t>
       </w:r>
       <w:r>
-        <w:t xml:space="preserve">aus dem Kühlschrank und stellen sie neben die Tasse. Kann Tasse 2 dadurch wärmer werden als Tasse 1? Begründen Sie mit einer Abschätzung und den Ergebnissen aus e).</w:t>
+        <w:t xml:space="preserve">neben der Tasse und wird nur von der Raumluft erwärmt. Kann Tasse 2 so wärmer werden als Tasse 1? Begründen Sie mit einer Abschätzung und e).</w:t>
       </w:r>
       <w:r>
         <w:br/>
-      </w:r>
-      <w:r>
-        <w:t xml:space="preserve">Zu (1):</w:t>
-      </w:r>
-      <w:r>
-        <w:t xml:space="preserve"> </w:t>
       </w:r>
       <m:oMath>
         <m:sSub>
@@ -2826,8 +2883,13 @@
       </m:oMath>
     </w:p>
     <w:p>
-      <w:pPr>
-        <w:pStyle w:val="FirstParagraph"/>
+      <w:r>
+        <w:br w:type="page"/>
+      </w:r>
+    </w:p>
+    <w:p>
+      <w:pPr>
+        <w:pStyle w:val="Baustein"/>
         <w:keepNext/>
       </w:pPr>
       <w:r>
@@ -2839,9 +2901,15 @@
         <w:t xml:space="preserve">Versuch zu Aufgabe 1</w:t>
       </w:r>
       <w:r>
+        <w:rPr>
+          <w:rStyle w:val="BausteinZusatz"/>
+        </w:rPr>
         <w:t xml:space="preserve"> </w:t>
       </w:r>
       <w:r>
+        <w:rPr>
+          <w:rStyle w:val="BausteinZusatz"/>
+        </w:rPr>
         <w:t xml:space="preserve">(im Tutorium, läuft neben der Rechnung)</w:t>
       </w:r>
     </w:p>
@@ -2850,17 +2918,7 @@
         <w:pStyle w:val="BodyText"/>
       </w:pPr>
       <w:r>
-        <w:rPr>
-          <w:iCs/>
-          <w:i/>
-        </w:rPr>
-        <w:t xml:space="preserve">Material:</w:t>
-      </w:r>
-      <w:r>
-        <w:t xml:space="preserve"> </w:t>
-      </w:r>
-      <w:r>
-        <w:t xml:space="preserve">drei gleiche Becher, heißes Wasser oder Kaffee aus der Thermoskanne, Milch aus der Kühltasche, ein kleines Glas, Messbecher, ein Einstichthermometer für alle Becher, Löffel, Uhr.</w:t>
+        <w:t xml:space="preserve">Drei gleiche, vorgewärmte Becher mit je 200 ml heißem Wasser oder Kaffee: Becher 1 bekommt die Milch sofort, Becher 2 und 3 erst nach 40 Minuten (Milch aus der Kühltasche bzw. aus einem Glas neben den Bechern). Nach 10 Minuten werden Becher 2 und 3 gemessen.</w:t>
       </w:r>
     </w:p>
     <w:p>
@@ -2872,7 +2930,24 @@
         <w:pStyle w:val="Compact"/>
       </w:pPr>
       <w:r>
-        <w:t xml:space="preserve">Notieren Sie Ihre Vermutung zu Frage 1.</w:t>
+        <w:t xml:space="preserve">Bestimmen Sie</w:t>
+      </w:r>
+      <w:r>
+        <w:t xml:space="preserve"> </w:t>
+      </w:r>
+      <m:oMath>
+        <m:r>
+          <m:t>k</m:t>
+        </m:r>
+        <m:r>
+          <m:t>A</m:t>
+        </m:r>
+      </m:oMath>
+      <w:r>
+        <w:t xml:space="preserve"> </w:t>
+      </w:r>
+      <w:r>
+        <w:t xml:space="preserve">aus dem Mittelwert wie in Teil c und sagen Sie mit den Gleichungen aus d) die Temperaturen nach 40 Minuten voraus (Becher 3 mit Milch bei Raumtemperatur).</w:t>
       </w:r>
     </w:p>
     <w:p>
@@ -2883,145 +2958,8 @@
         </w:numPr>
         <w:pStyle w:val="Compact"/>
       </w:pPr>
-      <m:oMath>
-        <m:r>
-          <m:t>t</m:t>
-        </m:r>
-        <m:r>
-          <m:rPr>
-            <m:sty m:val="p"/>
-          </m:rPr>
-          <m:t>=</m:t>
-        </m:r>
-        <m:r>
-          <m:t>0</m:t>
-        </m:r>
-      </m:oMath>
-      <w:r>
-        <w:t xml:space="preserve">: Becher vorwärmen, je 200 ml einfüllen und die Starttemperatur messen. Becher 1 bekommt die Milch sofort. Für Becher 2 bleibt die Milch in der Kühltasche, für Becher 3 steht sie im Glas neben dem Becher.</w:t>
-      </w:r>
-    </w:p>
-    <w:p>
-      <w:pPr>
-        <w:numPr>
-          <w:ilvl w:val="0"/>
-          <w:numId w:val="1003"/>
-        </w:numPr>
-        <w:pStyle w:val="Compact"/>
-      </w:pPr>
-      <m:oMath>
-        <m:r>
-          <m:t>t</m:t>
-        </m:r>
-        <m:r>
-          <m:rPr>
-            <m:sty m:val="p"/>
-          </m:rPr>
-          <m:t>=</m:t>
-        </m:r>
-        <m:r>
-          <m:t>10</m:t>
-        </m:r>
-        <m:r>
-          <m:t> </m:t>
-        </m:r>
-        <m:r>
-          <m:rPr>
-            <m:sty m:val="p"/>
-          </m:rPr>
-          <m:t>m</m:t>
-        </m:r>
-        <m:r>
-          <m:rPr>
-            <m:sty m:val="p"/>
-          </m:rPr>
-          <m:t>i</m:t>
-        </m:r>
-        <m:r>
-          <m:rPr>
-            <m:sty m:val="p"/>
-          </m:rPr>
-          <m:t>n</m:t>
-        </m:r>
-      </m:oMath>
-      <w:r>
-        <w:t xml:space="preserve">: Becher 2 messen und daraus</w:t>
-      </w:r>
-      <w:r>
-        <w:t xml:space="preserve"> </w:t>
-      </w:r>
-      <m:oMath>
-        <m:r>
-          <m:t>k</m:t>
-        </m:r>
-        <m:r>
-          <m:t>A</m:t>
-        </m:r>
-      </m:oMath>
-      <w:r>
-        <w:t xml:space="preserve"> </w:t>
-      </w:r>
-      <w:r>
-        <w:t xml:space="preserve">wie in Teil f (mit Becher) bestimmen.</w:t>
-      </w:r>
-    </w:p>
-    <w:p>
-      <w:pPr>
-        <w:numPr>
-          <w:ilvl w:val="0"/>
-          <w:numId w:val="1003"/>
-        </w:numPr>
-        <w:pStyle w:val="Compact"/>
-      </w:pPr>
-      <w:r>
-        <w:t xml:space="preserve">Mit den gemessenen Werten die Temperaturen nach 60 Minuten vorhersagen, für Becher 3 mit Milch bei Raumtemperatur.</w:t>
-      </w:r>
-    </w:p>
-    <w:p>
-      <w:pPr>
-        <w:numPr>
-          <w:ilvl w:val="0"/>
-          <w:numId w:val="1003"/>
-        </w:numPr>
-        <w:pStyle w:val="Compact"/>
-      </w:pPr>
-      <m:oMath>
-        <m:r>
-          <m:t>t</m:t>
-        </m:r>
-        <m:r>
-          <m:rPr>
-            <m:sty m:val="p"/>
-          </m:rPr>
-          <m:t>=</m:t>
-        </m:r>
-        <m:r>
-          <m:t>60</m:t>
-        </m:r>
-        <m:r>
-          <m:t> </m:t>
-        </m:r>
-        <m:r>
-          <m:rPr>
-            <m:sty m:val="p"/>
-          </m:rPr>
-          <m:t>m</m:t>
-        </m:r>
-        <m:r>
-          <m:rPr>
-            <m:sty m:val="p"/>
-          </m:rPr>
-          <m:t>i</m:t>
-        </m:r>
-        <m:r>
-          <m:rPr>
-            <m:sty m:val="p"/>
-          </m:rPr>
-          <m:t>n</m:t>
-        </m:r>
-      </m:oMath>
-      <w:r>
-        <w:t xml:space="preserve">: Milchtemperatur in Kühltasche und Glas messen, Milch in Becher 2 und 3 gießen, umrühren und alle drei Becher messen.</w:t>
+      <w:r>
+        <w:t xml:space="preserve">Ist der gemessene Unterschied zwischen Becher 1 und 2 größer als die Messunsicherheit? Nennen Sie zwei Gründe für Abweichungen vom Modell.</w:t>
       </w:r>
     </w:p>
     <w:tbl>
@@ -3032,13 +2970,17 @@
         <w:jc w:val="start"/>
       </w:tblPr>
       <w:tblGrid>
-        <w:gridCol w:w="2880"/>
-        <w:gridCol w:w="2520"/>
-        <w:gridCol w:w="2520"/>
+        <w:gridCol w:w="2269"/>
+        <w:gridCol w:w="1062"/>
+        <w:gridCol w:w="1159"/>
+        <w:gridCol w:w="1014"/>
+        <w:gridCol w:w="1207"/>
+        <w:gridCol w:w="1207"/>
       </w:tblGrid>
       <w:tr>
         <w:trPr>
           <w:cantSplit/>
+          <w:trHeight w:val="567" w:hRule="atLeast"/>
           <w:tblHeader w:val="true"/>
         </w:trPr>
         <w:tc>
@@ -3063,8 +3005,29 @@
               <w:jc w:val="left"/>
             </w:pPr>
             <w:r>
-              <w:t xml:space="preserve">Vorhersage nach 60 min</w:t>
+              <w:t xml:space="preserve">Start</w:t>
             </w:r>
+            <w:r>
+              <w:t xml:space="preserve"> </w:t>
+            </w:r>
+            <m:oMath>
+              <m:r>
+                <m:t>ϑ</m:t>
+              </m:r>
+              <m:d>
+                <m:dPr>
+                  <m:begChr m:val="("/>
+                  <m:endChr m:val=")"/>
+                  <m:sepChr m:val=""/>
+                  <m:grow/>
+                </m:dPr>
+                <m:e>
+                  <m:r>
+                    <m:t>0</m:t>
+                  </m:r>
+                </m:e>
+              </m:d>
+            </m:oMath>
           </w:p>
         </w:tc>
         <w:tc>
@@ -3075,15 +3038,192 @@
               <w:keepNext/>
               <w:jc w:val="left"/>
             </w:pPr>
+            <m:oMath>
+              <m:r>
+                <m:t>ϑ</m:t>
+              </m:r>
+              <m:d>
+                <m:dPr>
+                  <m:begChr m:val="("/>
+                  <m:endChr m:val=")"/>
+                  <m:sepChr m:val=""/>
+                  <m:grow/>
+                </m:dPr>
+                <m:e>
+                  <m:r>
+                    <m:t>10</m:t>
+                  </m:r>
+                  <m:r>
+                    <m:t> </m:t>
+                  </m:r>
+                  <m:r>
+                    <m:rPr>
+                      <m:sty m:val="p"/>
+                    </m:rPr>
+                    <m:t>m</m:t>
+                  </m:r>
+                  <m:r>
+                    <m:rPr>
+                      <m:sty m:val="p"/>
+                    </m:rPr>
+                    <m:t>i</m:t>
+                  </m:r>
+                  <m:r>
+                    <m:rPr>
+                      <m:sty m:val="p"/>
+                    </m:rPr>
+                    <m:t>n</m:t>
+                  </m:r>
+                </m:e>
+              </m:d>
+            </m:oMath>
+          </w:p>
+        </w:tc>
+        <w:tc>
+          <w:tcPr/>
+          <w:p>
+            <w:pPr>
+              <w:pStyle w:val="Compact"/>
+              <w:keepNext/>
+              <w:jc w:val="left"/>
+            </w:pPr>
             <w:r>
-              <w:t xml:space="preserve">Messung nach 60 min</w:t>
+              <w:t xml:space="preserve">Milch</w:t>
             </w:r>
+            <w:r>
+              <w:t xml:space="preserve"> </w:t>
+            </w:r>
+            <m:oMath>
+              <m:sSub>
+                <m:e>
+                  <m:r>
+                    <m:t>ϑ</m:t>
+                  </m:r>
+                </m:e>
+                <m:sub>
+                  <m:r>
+                    <m:t>M</m:t>
+                  </m:r>
+                </m:sub>
+              </m:sSub>
+            </m:oMath>
+          </w:p>
+        </w:tc>
+        <w:tc>
+          <w:tcPr/>
+          <w:p>
+            <w:pPr>
+              <w:pStyle w:val="Compact"/>
+              <w:keepNext/>
+              <w:jc w:val="left"/>
+            </w:pPr>
+            <w:r>
+              <w:t xml:space="preserve">Vorhersage</w:t>
+            </w:r>
+            <w:r>
+              <w:t xml:space="preserve"> </w:t>
+            </w:r>
+            <m:oMath>
+              <m:r>
+                <m:t>ϑ</m:t>
+              </m:r>
+              <m:d>
+                <m:dPr>
+                  <m:begChr m:val="("/>
+                  <m:endChr m:val=")"/>
+                  <m:sepChr m:val=""/>
+                  <m:grow/>
+                </m:dPr>
+                <m:e>
+                  <m:r>
+                    <m:t>40</m:t>
+                  </m:r>
+                  <m:r>
+                    <m:t> </m:t>
+                  </m:r>
+                  <m:r>
+                    <m:rPr>
+                      <m:sty m:val="p"/>
+                    </m:rPr>
+                    <m:t>m</m:t>
+                  </m:r>
+                  <m:r>
+                    <m:rPr>
+                      <m:sty m:val="p"/>
+                    </m:rPr>
+                    <m:t>i</m:t>
+                  </m:r>
+                  <m:r>
+                    <m:rPr>
+                      <m:sty m:val="p"/>
+                    </m:rPr>
+                    <m:t>n</m:t>
+                  </m:r>
+                </m:e>
+              </m:d>
+            </m:oMath>
+          </w:p>
+        </w:tc>
+        <w:tc>
+          <w:tcPr/>
+          <w:p>
+            <w:pPr>
+              <w:pStyle w:val="Compact"/>
+              <w:keepNext/>
+              <w:jc w:val="left"/>
+            </w:pPr>
+            <w:r>
+              <w:t xml:space="preserve">Messung</w:t>
+            </w:r>
+            <w:r>
+              <w:t xml:space="preserve"> </w:t>
+            </w:r>
+            <m:oMath>
+              <m:r>
+                <m:t>ϑ</m:t>
+              </m:r>
+              <m:d>
+                <m:dPr>
+                  <m:begChr m:val="("/>
+                  <m:endChr m:val=")"/>
+                  <m:sepChr m:val=""/>
+                  <m:grow/>
+                </m:dPr>
+                <m:e>
+                  <m:r>
+                    <m:t>40</m:t>
+                  </m:r>
+                  <m:r>
+                    <m:t> </m:t>
+                  </m:r>
+                  <m:r>
+                    <m:rPr>
+                      <m:sty m:val="p"/>
+                    </m:rPr>
+                    <m:t>m</m:t>
+                  </m:r>
+                  <m:r>
+                    <m:rPr>
+                      <m:sty m:val="p"/>
+                    </m:rPr>
+                    <m:t>i</m:t>
+                  </m:r>
+                  <m:r>
+                    <m:rPr>
+                      <m:sty m:val="p"/>
+                    </m:rPr>
+                    <m:t>n</m:t>
+                  </m:r>
+                </m:e>
+              </m:d>
+            </m:oMath>
           </w:p>
         </w:tc>
       </w:tr>
       <w:tr>
         <w:trPr>
           <w:cantSplit/>
+          <w:trHeight w:val="567" w:hRule="atLeast"/>
         </w:trPr>
         <w:tc>
           <w:tcPr/>
@@ -3096,6 +3236,33 @@
             <w:r>
               <w:t xml:space="preserve">1: Milch sofort</w:t>
             </w:r>
+          </w:p>
+        </w:tc>
+        <w:tc>
+          <w:tcPr/>
+          <w:p>
+            <w:pPr>
+              <w:pStyle w:val="Compact"/>
+              <w:keepNext/>
+            </w:pPr>
+          </w:p>
+        </w:tc>
+        <w:tc>
+          <w:tcPr/>
+          <w:p>
+            <w:pPr>
+              <w:pStyle w:val="Compact"/>
+              <w:keepNext/>
+            </w:pPr>
+          </w:p>
+        </w:tc>
+        <w:tc>
+          <w:tcPr/>
+          <w:p>
+            <w:pPr>
+              <w:pStyle w:val="Compact"/>
+              <w:keepNext/>
+            </w:pPr>
           </w:p>
         </w:tc>
         <w:tc>
@@ -3120,6 +3287,7 @@
       <w:tr>
         <w:trPr>
           <w:cantSplit/>
+          <w:trHeight w:val="567" w:hRule="atLeast"/>
         </w:trPr>
         <w:tc>
           <w:tcPr/>
@@ -3130,8 +3298,35 @@
               <w:jc w:val="left"/>
             </w:pPr>
             <w:r>
-              <w:t xml:space="preserve">2: Milch nach 60 min aus der Kühltasche</w:t>
+              <w:t xml:space="preserve">2: Milch nach 40 min aus der Kühltasche</w:t>
             </w:r>
+          </w:p>
+        </w:tc>
+        <w:tc>
+          <w:tcPr/>
+          <w:p>
+            <w:pPr>
+              <w:pStyle w:val="Compact"/>
+              <w:keepNext/>
+            </w:pPr>
+          </w:p>
+        </w:tc>
+        <w:tc>
+          <w:tcPr/>
+          <w:p>
+            <w:pPr>
+              <w:pStyle w:val="Compact"/>
+              <w:keepNext/>
+            </w:pPr>
+          </w:p>
+        </w:tc>
+        <w:tc>
+          <w:tcPr/>
+          <w:p>
+            <w:pPr>
+              <w:pStyle w:val="Compact"/>
+              <w:keepNext/>
+            </w:pPr>
           </w:p>
         </w:tc>
         <w:tc>
@@ -3156,6 +3351,7 @@
       <w:tr>
         <w:trPr>
           <w:cantSplit/>
+          <w:trHeight w:val="567" w:hRule="atLeast"/>
         </w:trPr>
         <w:tc>
           <w:tcPr/>
@@ -3165,8 +3361,32 @@
               <w:jc w:val="left"/>
             </w:pPr>
             <w:r>
-              <w:t xml:space="preserve">3: Milch nach 60 min aus dem Glas</w:t>
+              <w:t xml:space="preserve">3: Milch nach 40 min aus dem Glas</w:t>
             </w:r>
+          </w:p>
+        </w:tc>
+        <w:tc>
+          <w:tcPr/>
+          <w:p>
+            <w:pPr>
+              <w:pStyle w:val="Compact"/>
+            </w:pPr>
+          </w:p>
+        </w:tc>
+        <w:tc>
+          <w:tcPr/>
+          <w:p>
+            <w:pPr>
+              <w:pStyle w:val="Compact"/>
+            </w:pPr>
+          </w:p>
+        </w:tc>
+        <w:tc>
+          <w:tcPr/>
+          <w:p>
+            <w:pPr>
+              <w:pStyle w:val="Compact"/>
+            </w:pPr>
           </w:p>
         </w:tc>
         <w:tc>
@@ -3187,6 +3407,41 @@
         </w:tc>
       </w:tr>
     </w:tbl>
+    <w:p>
+      <w:pPr>
+        <w:pStyle w:val="BodyText"/>
+      </w:pPr>
+      <w:r>
+        <w:t xml:space="preserve">Raumtemperatur: __________ °C</w:t>
+      </w:r>
+    </w:p>
+    <w:p>
+      <w:pPr>
+        <w:pStyle w:val="BodyText"/>
+      </w:pPr>
+      <w:r>
+        <w:t xml:space="preserve">Mischtemperatur Becher 1: __________ °C</w:t>
+      </w:r>
+    </w:p>
+    <w:p>
+      <w:pPr>
+        <w:pStyle w:val="BodyText"/>
+      </w:pPr>
+      <m:oMath>
+        <m:r>
+          <m:t>k</m:t>
+        </m:r>
+        <m:r>
+          <m:t>A</m:t>
+        </m:r>
+      </m:oMath>
+      <w:r>
+        <w:t xml:space="preserve"> </w:t>
+      </w:r>
+      <w:r>
+        <w:t xml:space="preserve">aus Becher 2 und 3: __________ W/K</w:t>
+      </w:r>
+    </w:p>
     <w:sectPr>
       <w:headerReference r:id="rId9" w:type="default"/>
       <w:footerReference r:id="rId10" w:type="default"/>
@@ -3261,7 +3516,7 @@
       <w:tab/>
       <w:t>Wärmeübertragung</w:t>
       <w:tab/>
-      <w:t>Entwurf, Stand 23.10.2026</w:t>
+      <w:t>Entwurf, Stand 30.10.2026</w:t>
     </w:r>
   </w:p>
 </w:hdr>
@@ -4199,6 +4454,74 @@
       <w:rFonts w:ascii="Calibri" w:cs="Calibri" w:eastAsia="Calibri" w:hAnsi="Calibri"/>
       <w:color w:val="000000"/>
       <w:sz w:val="28"/>
+    </w:rPr>
+  </w:style>
+  <w:style w:customStyle="1" w:styleId="Blatttitel" w:type="paragraph">
+    <w:name w:val="Blatttitel"/>
+    <w:basedOn w:val="BodyText"/>
+    <w:next w:val="BodyText"/>
+    <w:qFormat/>
+    <w:pPr>
+      <w:keepNext/>
+      <w:spacing w:after="240" w:before="0"/>
+      <w:jc w:val="center"/>
+    </w:pPr>
+    <w:rPr>
+      <w:b/>
+      <w:bCs/>
+      <w:sz w:val="36"/>
+      <w:szCs w:val="36"/>
+    </w:rPr>
+  </w:style>
+  <w:style w:customStyle="1" w:styleId="Baustein" w:type="paragraph">
+    <w:name w:val="Baustein"/>
+    <w:basedOn w:val="BodyText"/>
+    <w:next w:val="BodyText"/>
+    <w:qFormat/>
+    <w:pPr>
+      <w:keepNext/>
+      <w:spacing w:after="120" w:before="360"/>
+      <w:jc w:val="left"/>
+    </w:pPr>
+    <w:rPr>
+      <w:sz w:val="28"/>
+      <w:szCs w:val="28"/>
+    </w:rPr>
+  </w:style>
+  <w:style w:customStyle="1" w:styleId="BausteinZusatz" w:type="character">
+    <w:name w:val="BausteinZusatz"/>
+    <w:qFormat/>
+    <w:rPr>
+      <w:b w:val="0"/>
+      <w:bCs w:val="0"/>
+      <w:u w:val="none"/>
+      <w:sz w:val="22"/>
+      <w:szCs w:val="22"/>
+    </w:rPr>
+  </w:style>
+  <w:style w:customStyle="1" w:styleId="Abbildung" w:type="paragraph">
+    <w:name w:val="Abbildung"/>
+    <w:basedOn w:val="BodyText"/>
+    <w:next w:val="Bildunterschrift"/>
+    <w:qFormat/>
+    <w:pPr>
+      <w:keepNext/>
+      <w:spacing w:after="0" w:before="120"/>
+      <w:jc w:val="center"/>
+    </w:pPr>
+  </w:style>
+  <w:style w:customStyle="1" w:styleId="Bildunterschrift" w:type="paragraph">
+    <w:name w:val="Bildunterschrift"/>
+    <w:basedOn w:val="BodyText"/>
+    <w:next w:val="BodyText"/>
+    <w:qFormat/>
+    <w:pPr>
+      <w:spacing w:after="240" w:before="80"/>
+      <w:jc w:val="center"/>
+    </w:pPr>
+    <w:rPr>
+      <w:sz w:val="20"/>
+      <w:szCs w:val="20"/>
     </w:rPr>
   </w:style>
   <w:style w:type="paragraph" w:customStyle="1" w:styleId="SourceCode">

</xml_diff>

<commit_message>
Zweite Runde Rolle S ausgewertet: eindeutige Fehler behoben, S1 bis S11 zur Entscheidung, Protokolle Version 10 gebaut
Co-Authored-By: Claude Opus 5.5 <noreply@anthropic.com>
Claude-Session: https://claude.ai/code/session_01H6HhHh1SmuARGHNzYGswr7
</commit_message>
<xml_diff>
--- a/pruefung/Kaffee_Pruefpaket_2026-10-23/umsetzung/Arbeitsordner/kaffee/Kaffee_Aufgabe.docx
+++ b/pruefung/Kaffee_Pruefpaket_2026-10-23/umsetzung/Arbeitsordner/kaffee/Kaffee_Aufgabe.docx
@@ -2918,7 +2918,7 @@
         <w:pStyle w:val="BodyText"/>
       </w:pPr>
       <w:r>
-        <w:t xml:space="preserve">Drei gleiche, vorgewärmte Becher mit je 200 ml heißem Wasser oder Kaffee: Becher 1 bekommt die Milch sofort, Becher 2 und 3 erst nach 40 Minuten (Milch aus der Kühltasche bzw. aus einem Glas neben den Bechern). Nach 10 Minuten werden Becher 2 und 3 gemessen.</w:t>
+        <w:t xml:space="preserve">Drei gleiche, vorgewärmte Becher mit je 200 ml heißem Wasser oder Kaffee und je 30 ml Milch: Becher 1 bekommt die Milch sofort, Becher 2 und 3 erst nach 40 Minuten (Milch aus der Kühltasche bzw. aus einem Glas mit etwas Abstand zu den Bechern). Nach 10 Minuten werden Becher 2 und 3 gemessen.</w:t>
       </w:r>
     </w:p>
     <w:p>
@@ -2947,7 +2947,7 @@
         <w:t xml:space="preserve"> </w:t>
       </w:r>
       <w:r>
-        <w:t xml:space="preserve">aus dem Mittelwert wie in Teil c und sagen Sie mit den Gleichungen aus d) die Temperaturen nach 40 Minuten voraus (Becher 3 mit Milch bei Raumtemperatur).</w:t>
+        <w:t xml:space="preserve">wie in Teil c aus dem Mittelwert der beiden Messungen und sagen Sie mit den Gleichungen aus d) die Temperaturen nach 40 Minuten voraus (Becher 3 mit Milch bei Raumtemperatur).</w:t>
       </w:r>
     </w:p>
     <w:p>

</xml_diff>

<commit_message>
Abnahme durch Codex: alle sechs Befunde behoben, Zeitplan mit Simulation, Protokolle Version 11
Co-Authored-By: Claude Opus 5.5 <noreply@anthropic.com>
Claude-Session: https://claude.ai/code/session_01H6HhHh1SmuARGHNzYGswr7
</commit_message>
<xml_diff>
--- a/pruefung/Kaffee_Pruefpaket_2026-10-23/umsetzung/Arbeitsordner/kaffee/Kaffee_Aufgabe.docx
+++ b/pruefung/Kaffee_Pruefpaket_2026-10-23/umsetzung/Arbeitsordner/kaffee/Kaffee_Aufgabe.docx
@@ -238,9 +238,15 @@
           </m:e>
           <m:sub>
             <m:r>
+              <m:rPr>
+                <m:sty m:val="p"/>
+              </m:rPr>
               <m:t>a</m:t>
             </m:r>
             <m:r>
+              <m:rPr>
+                <m:sty m:val="p"/>
+              </m:rPr>
               <m:t>b</m:t>
             </m:r>
           </m:sub>
@@ -285,6 +291,9 @@
               </m:e>
               <m:sub>
                 <m:r>
+                  <m:rPr>
+                    <m:sty m:val="p"/>
+                  </m:rPr>
                   <m:t>u</m:t>
                 </m:r>
               </m:sub>
@@ -376,20 +385,24 @@
     <w:tbl>
       <w:tblPr>
         <w:tblStyle w:val="Table"/>
-        <w:tblW w:type="pct" w:w="5000"/>
+        <w:tblW w:type="dxa" w:w="9070"/>
+        <w:tblLayout w:type="fixed"/>
+        <w:tblCellMar>
+          <w:left w:w="80" w:type="dxa"/>
+          <w:right w:w="80" w:type="dxa"/>
+        </w:tblCellMar>
         <w:tblLook w:firstRow="1" w:lastRow="0" w:firstColumn="0" w:lastColumn="0" w:noHBand="0" w:noVBand="0" w:val="0020"/>
         <w:jc w:val="start"/>
       </w:tblPr>
       <w:tblGrid>
-        <w:gridCol w:w="1835"/>
-        <w:gridCol w:w="2124"/>
-        <w:gridCol w:w="1835"/>
-        <w:gridCol w:w="2124"/>
+        <w:gridCol w:w="2211"/>
+        <w:gridCol w:w="2324"/>
+        <w:gridCol w:w="2211"/>
+        <w:gridCol w:w="2324"/>
       </w:tblGrid>
       <w:tr>
         <w:trPr>
           <w:cantSplit/>
-          <w:tblHeader w:val="true"/>
         </w:trPr>
         <w:tc>
           <w:tcPr/>
@@ -478,6 +491,9 @@
                 </m:e>
                 <m:sub>
                   <m:r>
+                    <m:rPr>
+                      <m:sty m:val="p"/>
+                    </m:rPr>
                     <m:t>K</m:t>
                   </m:r>
                 </m:sub>
@@ -539,6 +555,9 @@
                 </m:e>
                 <m:sub>
                   <m:r>
+                    <m:rPr>
+                      <m:sty m:val="p"/>
+                    </m:rPr>
                     <m:t>M</m:t>
                   </m:r>
                 </m:sub>
@@ -605,6 +624,9 @@
                 </m:e>
                 <m:sub>
                   <m:r>
+                    <m:rPr>
+                      <m:sty m:val="p"/>
+                    </m:rPr>
                     <m:t>K</m:t>
                   </m:r>
                 </m:sub>
@@ -690,6 +712,9 @@
                 </m:e>
                 <m:sub>
                   <m:r>
+                    <m:rPr>
+                      <m:sty m:val="p"/>
+                    </m:rPr>
                     <m:t>M</m:t>
                   </m:r>
                 </m:sub>
@@ -789,6 +814,9 @@
                     <m:t>,</m:t>
                   </m:r>
                   <m:r>
+                    <m:rPr>
+                      <m:sty m:val="p"/>
+                    </m:rPr>
                     <m:t>K</m:t>
                   </m:r>
                 </m:sub>
@@ -908,6 +936,9 @@
                     <m:t>,</m:t>
                   </m:r>
                   <m:r>
+                    <m:rPr>
+                      <m:sty m:val="p"/>
+                    </m:rPr>
                     <m:t>M</m:t>
                   </m:r>
                 </m:sub>
@@ -1023,6 +1054,9 @@
                 </m:e>
                 <m:sub>
                   <m:r>
+                    <m:rPr>
+                      <m:sty m:val="p"/>
+                    </m:rPr>
                     <m:t>K</m:t>
                   </m:r>
                   <m:r>
@@ -1093,6 +1127,9 @@
                 </m:e>
                 <m:sub>
                   <m:r>
+                    <m:rPr>
+                      <m:sty m:val="p"/>
+                    </m:rPr>
                     <m:t>M</m:t>
                   </m:r>
                 </m:sub>
@@ -1216,6 +1253,9 @@
                 </m:e>
                 <m:sub>
                   <m:r>
+                    <m:rPr>
+                      <m:sty m:val="p"/>
+                    </m:rPr>
                     <m:t>u</m:t>
                   </m:r>
                 </m:sub>
@@ -1277,6 +1317,9 @@
                 </m:e>
                 <m:sub>
                   <m:r>
+                    <m:rPr>
+                      <m:sty m:val="p"/>
+                    </m:rPr>
                     <m:t>K</m:t>
                   </m:r>
                 </m:sub>
@@ -1434,6 +1477,9 @@
                 </m:e>
                 <m:sub>
                   <m:r>
+                    <m:rPr>
+                      <m:sty m:val="p"/>
+                    </m:rPr>
                     <m:t>M</m:t>
                   </m:r>
                   <m:r>
@@ -1443,6 +1489,9 @@
                     <m:t>,</m:t>
                   </m:r>
                   <m:r>
+                    <m:rPr>
+                      <m:sty m:val="p"/>
+                    </m:rPr>
                     <m:t>h</m:t>
                   </m:r>
                 </m:sub>
@@ -1504,6 +1553,9 @@
                 </m:e>
                 <m:sub>
                   <m:r>
+                    <m:rPr>
+                      <m:sty m:val="p"/>
+                    </m:rPr>
                     <m:t>B</m:t>
                   </m:r>
                 </m:sub>
@@ -1578,6 +1630,9 @@
                 </m:e>
                 <m:sub>
                   <m:r>
+                    <m:rPr>
+                      <m:sty m:val="p"/>
+                    </m:rPr>
                     <m:t>B</m:t>
                   </m:r>
                 </m:sub>
@@ -1879,6 +1934,9 @@
           </m:e>
           <m:sub>
             <m:r>
+              <m:rPr>
+                <m:sty m:val="p"/>
+              </m:rPr>
               <m:t>u</m:t>
             </m:r>
           </m:sub>
@@ -1923,6 +1981,9 @@
               </m:e>
               <m:sub>
                 <m:r>
+                  <m:rPr>
+                    <m:sty m:val="p"/>
+                  </m:rPr>
                   <m:t>u</m:t>
                 </m:r>
               </m:sub>
@@ -2418,6 +2479,9 @@
           </m:e>
           <m:sub>
             <m:r>
+              <m:rPr>
+                <m:sty m:val="p"/>
+              </m:rPr>
               <m:t>M</m:t>
             </m:r>
             <m:r>
@@ -2427,6 +2491,9 @@
               <m:t>,</m:t>
             </m:r>
             <m:r>
+              <m:rPr>
+                <m:sty m:val="p"/>
+              </m:rPr>
               <m:t>h</m:t>
             </m:r>
           </m:sub>
@@ -2860,7 +2927,6 @@
         <w:trPr>
           <w:cantSplit/>
           <w:trHeight w:val="567" w:hRule="atLeast"/>
-          <w:tblHeader w:val="true"/>
         </w:trPr>
         <w:tc>
           <w:tcPr/>
@@ -2981,6 +3047,9 @@
                 </m:e>
                 <m:sub>
                   <m:r>
+                    <m:rPr>
+                      <m:sty m:val="p"/>
+                    </m:rPr>
                     <m:t>M</m:t>
                   </m:r>
                 </m:sub>
@@ -3566,6 +3635,10 @@
       <w:pPr>
         <w:ind w:left="720" w:hanging="480"/>
       </w:pPr>
+      <w:rPr>
+        <w:b/>
+        <w:bCs/>
+      </w:rPr>
     </w:lvl>
     <w:lvl w:ilvl="1">
       <w:start w:val="1"/>
@@ -3575,6 +3648,10 @@
       <w:pPr>
         <w:ind w:left="1440" w:hanging="480"/>
       </w:pPr>
+      <w:rPr>
+        <w:b/>
+        <w:bCs/>
+      </w:rPr>
     </w:lvl>
     <w:lvl w:ilvl="2">
       <w:start w:val="1"/>
@@ -3584,6 +3661,10 @@
       <w:pPr>
         <w:ind w:left="2160" w:hanging="480"/>
       </w:pPr>
+      <w:rPr>
+        <w:b/>
+        <w:bCs/>
+      </w:rPr>
     </w:lvl>
     <w:lvl w:ilvl="3">
       <w:start w:val="1"/>
@@ -3593,6 +3674,10 @@
       <w:pPr>
         <w:ind w:left="2880" w:hanging="480"/>
       </w:pPr>
+      <w:rPr>
+        <w:b/>
+        <w:bCs/>
+      </w:rPr>
     </w:lvl>
     <w:lvl w:ilvl="4">
       <w:start w:val="1"/>
@@ -3602,6 +3687,10 @@
       <w:pPr>
         <w:ind w:left="3600" w:hanging="480"/>
       </w:pPr>
+      <w:rPr>
+        <w:b/>
+        <w:bCs/>
+      </w:rPr>
     </w:lvl>
     <w:lvl w:ilvl="5">
       <w:start w:val="1"/>
@@ -3611,6 +3700,10 @@
       <w:pPr>
         <w:ind w:left="4320" w:hanging="480"/>
       </w:pPr>
+      <w:rPr>
+        <w:b/>
+        <w:bCs/>
+      </w:rPr>
     </w:lvl>
     <w:lvl w:ilvl="6">
       <w:start w:val="1"/>
@@ -3620,6 +3713,10 @@
       <w:pPr>
         <w:ind w:left="5040" w:hanging="480"/>
       </w:pPr>
+      <w:rPr>
+        <w:b/>
+        <w:bCs/>
+      </w:rPr>
     </w:lvl>
     <w:lvl w:ilvl="7">
       <w:start w:val="1"/>
@@ -3629,6 +3726,10 @@
       <w:pPr>
         <w:ind w:left="5760" w:hanging="480"/>
       </w:pPr>
+      <w:rPr>
+        <w:b/>
+        <w:bCs/>
+      </w:rPr>
     </w:lvl>
     <w:lvl w:ilvl="8">
       <w:start w:val="1"/>
@@ -3638,6 +3739,10 @@
       <w:pPr>
         <w:ind w:left="6480" w:hanging="480"/>
       </w:pPr>
+      <w:rPr>
+        <w:b/>
+        <w:bCs/>
+      </w:rPr>
     </w:lvl>
   </w:abstractNum>
   <w:abstractNum w:abstractNumId="99411">
@@ -3651,6 +3756,10 @@
       <w:pPr>
         <w:ind w:left="720" w:hanging="480"/>
       </w:pPr>
+      <w:rPr>
+        <w:b/>
+        <w:bCs/>
+      </w:rPr>
     </w:lvl>
     <w:lvl w:ilvl="1">
       <w:start w:val="1"/>
@@ -3660,6 +3769,10 @@
       <w:pPr>
         <w:ind w:left="1440" w:hanging="480"/>
       </w:pPr>
+      <w:rPr>
+        <w:b/>
+        <w:bCs/>
+      </w:rPr>
     </w:lvl>
     <w:lvl w:ilvl="2">
       <w:start w:val="1"/>
@@ -3669,6 +3782,10 @@
       <w:pPr>
         <w:ind w:left="2160" w:hanging="480"/>
       </w:pPr>
+      <w:rPr>
+        <w:b/>
+        <w:bCs/>
+      </w:rPr>
     </w:lvl>
     <w:lvl w:ilvl="3">
       <w:start w:val="1"/>
@@ -3678,6 +3795,10 @@
       <w:pPr>
         <w:ind w:left="2880" w:hanging="480"/>
       </w:pPr>
+      <w:rPr>
+        <w:b/>
+        <w:bCs/>
+      </w:rPr>
     </w:lvl>
     <w:lvl w:ilvl="4">
       <w:start w:val="1"/>
@@ -3687,6 +3808,10 @@
       <w:pPr>
         <w:ind w:left="3600" w:hanging="480"/>
       </w:pPr>
+      <w:rPr>
+        <w:b/>
+        <w:bCs/>
+      </w:rPr>
     </w:lvl>
     <w:lvl w:ilvl="5">
       <w:start w:val="1"/>
@@ -3696,6 +3821,10 @@
       <w:pPr>
         <w:ind w:left="4320" w:hanging="480"/>
       </w:pPr>
+      <w:rPr>
+        <w:b/>
+        <w:bCs/>
+      </w:rPr>
     </w:lvl>
     <w:lvl w:ilvl="6">
       <w:start w:val="1"/>
@@ -3705,6 +3834,10 @@
       <w:pPr>
         <w:ind w:left="5040" w:hanging="480"/>
       </w:pPr>
+      <w:rPr>
+        <w:b/>
+        <w:bCs/>
+      </w:rPr>
     </w:lvl>
     <w:lvl w:ilvl="7">
       <w:start w:val="1"/>
@@ -3714,6 +3847,10 @@
       <w:pPr>
         <w:ind w:left="5760" w:hanging="480"/>
       </w:pPr>
+      <w:rPr>
+        <w:b/>
+        <w:bCs/>
+      </w:rPr>
     </w:lvl>
     <w:lvl w:ilvl="8">
       <w:start w:val="1"/>
@@ -3723,6 +3860,10 @@
       <w:pPr>
         <w:ind w:left="6480" w:hanging="480"/>
       </w:pPr>
+      <w:rPr>
+        <w:b/>
+        <w:bCs/>
+      </w:rPr>
     </w:lvl>
   </w:abstractNum>
   <w:num w:numId="1000">
@@ -4385,7 +4526,7 @@
     <w:qFormat/>
     <w:pPr>
       <w:keepNext/>
-      <w:spacing w:after="0" w:before="120"/>
+      <w:spacing w:after="0" w:before="80"/>
       <w:jc w:val="center"/>
     </w:pPr>
   </w:style>

</xml_diff>